<commit_message>
reports, email config, and scheme changes
</commit_message>
<xml_diff>
--- a/Project_Closure_Report_Scanify_Stedman_v1.0.docx
+++ b/Project_Closure_Report_Scanify_Stedman_v1.0.docx
@@ -490,7 +490,7 @@
                 <w:color w:val="222222"/>
                 <w:sz w:val="20"/>
               </w:rPr>
-              <w:t>Frappe / MariaDB - Division-controlled web portal</w:t>
+              <w:t>MariaDB - Division-controlled web portal</w:t>
             </w:r>
           </w:p>
         </w:tc>
@@ -1983,7 +1983,7 @@
           <w:color w:val="222222"/>
           <w:sz w:val="21"/>
         </w:rPr>
-        <w:t>These include the Scheme Deduction Engine, Sales Target Module, Bulk Statement Processing, QC Validation Workflow, Self-Learning Product Mapping, Expanded Reporting Suite, Operational Data Utilities, Primary Sales Management, the Analytics Chatbot and Stock Statement Data Recovery (CR-01 to CR-10), along with the Portal Migration CR. Reference: [CR register / folder].</w:t>
+        <w:t>These items are tracked separately in a Change Request register and are being reviewed and commercially finalized with the client team, independent of the original project scope. Reference: [CR register / folder].</w:t>
       </w:r>
     </w:p>
     <w:p>

</xml_diff>